<commit_message>
Add evidence-grounded current research loop
</commit_message>
<xml_diff>
--- a/eck-digital-life-kernel/docs/ECK_Digital_Life_Kernel_v0.2.0_Development_Specification_zh-TW.docx
+++ b/eck-digital-life-kernel/docs/ECK_Digital_Life_Kernel_v0.2.0_Development_Specification_zh-TW.docx
@@ -287,7 +287,7 @@
           <w:sz w:val="18"/>
           <w:lang w:val="en-US" w:eastAsia="zh-TW"/>
         </w:rPr>
-        <w:t>Development specification generated 2026-08-02</w:t>
+        <w:t>Development specification generated 2026-08-08</w:t>
       </w:r>
     </w:p>
     <w:p>
@@ -986,6 +986,90 @@
                 <w:sz w:val="17"/>
                 <w:lang w:val="en-US" w:eastAsia="zh-TW"/>
               </w:rPr>
+              <w:t>M2.0</w:t>
+            </w:r>
+          </w:p>
+        </w:tc>
+        <w:tc>
+          <w:tcPr>
+            <w:tcW w:type="dxa" w:w="3380"/>
+            <w:tcMar>
+              <w:top w:w="80" w:type="dxa"/>
+              <w:start w:w="120" w:type="dxa"/>
+              <w:bottom w:w="80" w:type="dxa"/>
+              <w:end w:w="120" w:type="dxa"/>
+            </w:tcMar>
+            <w:vAlign w:val="center"/>
+          </w:tcPr>
+          <w:p>
+            <w:pPr>
+              <w:spacing w:after="30" w:line="259" w:lineRule="auto"/>
+            </w:pPr>
+            <w:r>
+              <w:rPr>
+                <w:rFonts w:ascii="Aptos" w:hAnsi="Aptos" w:eastAsia="Noto Sans T Chinese"/>
+                <w:color w:val="23313F"/>
+                <w:sz w:val="17"/>
+                <w:lang w:val="en-US" w:eastAsia="zh-TW"/>
+              </w:rPr>
+              <w:t>最新資訊批判學習</w:t>
+            </w:r>
+          </w:p>
+        </w:tc>
+        <w:tc>
+          <w:tcPr>
+            <w:tcW w:type="dxa" w:w="4780"/>
+            <w:tcMar>
+              <w:top w:w="80" w:type="dxa"/>
+              <w:start w:w="120" w:type="dxa"/>
+              <w:bottom w:w="80" w:type="dxa"/>
+              <w:end w:w="120" w:type="dxa"/>
+            </w:tcMar>
+            <w:vAlign w:val="center"/>
+          </w:tcPr>
+          <w:p>
+            <w:pPr>
+              <w:spacing w:after="30" w:line="259" w:lineRule="auto"/>
+            </w:pPr>
+            <w:r>
+              <w:rPr>
+                <w:rFonts w:ascii="Aptos" w:hAnsi="Aptos" w:eastAsia="Noto Sans T Chinese"/>
+                <w:color w:val="23313F"/>
+                <w:sz w:val="17"/>
+                <w:lang w:val="en-US" w:eastAsia="zh-TW"/>
+              </w:rPr>
+              <w:t>來源快照、主張證據、無結論品質閘門</w:t>
+            </w:r>
+          </w:p>
+        </w:tc>
+      </w:tr>
+      <w:tr>
+        <w:trPr>
+          <w:cantSplit w:val="true"/>
+        </w:trPr>
+        <w:tc>
+          <w:tcPr>
+            <w:tcW w:type="dxa" w:w="1200"/>
+            <w:tcMar>
+              <w:top w:w="80" w:type="dxa"/>
+              <w:start w:w="120" w:type="dxa"/>
+              <w:bottom w:w="80" w:type="dxa"/>
+              <w:end w:w="120" w:type="dxa"/>
+            </w:tcMar>
+            <w:vAlign w:val="center"/>
+            <w:shd w:fill="F7F9FB"/>
+          </w:tcPr>
+          <w:p>
+            <w:pPr>
+              <w:spacing w:after="30" w:line="259" w:lineRule="auto"/>
+            </w:pPr>
+            <w:r>
+              <w:rPr>
+                <w:rFonts w:ascii="Aptos" w:hAnsi="Aptos" w:eastAsia="Noto Sans T Chinese"/>
+                <w:color w:val="23313F"/>
+                <w:sz w:val="17"/>
+                <w:lang w:val="en-US" w:eastAsia="zh-TW"/>
+              </w:rPr>
               <w:t>M2.1</w:t>
             </w:r>
           </w:p>
@@ -1000,6 +1084,7 @@
               <w:end w:w="120" w:type="dxa"/>
             </w:tcMar>
             <w:vAlign w:val="center"/>
+            <w:shd w:fill="F7F9FB"/>
           </w:tcPr>
           <w:p>
             <w:pPr>
@@ -1026,6 +1111,7 @@
               <w:end w:w="120" w:type="dxa"/>
             </w:tcMar>
             <w:vAlign w:val="center"/>
+            <w:shd w:fill="F7F9FB"/>
           </w:tcPr>
           <w:p>
             <w:pPr>
@@ -1057,7 +1143,6 @@
               <w:end w:w="120" w:type="dxa"/>
             </w:tcMar>
             <w:vAlign w:val="center"/>
-            <w:shd w:fill="F7F9FB"/>
           </w:tcPr>
           <w:p>
             <w:pPr>
@@ -1084,7 +1169,6 @@
               <w:end w:w="120" w:type="dxa"/>
             </w:tcMar>
             <w:vAlign w:val="center"/>
-            <w:shd w:fill="F7F9FB"/>
           </w:tcPr>
           <w:p>
             <w:pPr>
@@ -1111,7 +1195,6 @@
               <w:end w:w="120" w:type="dxa"/>
             </w:tcMar>
             <w:vAlign w:val="center"/>
-            <w:shd w:fill="F7F9FB"/>
           </w:tcPr>
           <w:p>
             <w:pPr>
@@ -1143,6 +1226,7 @@
               <w:end w:w="120" w:type="dxa"/>
             </w:tcMar>
             <w:vAlign w:val="center"/>
+            <w:shd w:fill="F7F9FB"/>
           </w:tcPr>
           <w:p>
             <w:pPr>
@@ -1169,6 +1253,7 @@
               <w:end w:w="120" w:type="dxa"/>
             </w:tcMar>
             <w:vAlign w:val="center"/>
+            <w:shd w:fill="F7F9FB"/>
           </w:tcPr>
           <w:p>
             <w:pPr>
@@ -1195,6 +1280,7 @@
               <w:end w:w="120" w:type="dxa"/>
             </w:tcMar>
             <w:vAlign w:val="center"/>
+            <w:shd w:fill="F7F9FB"/>
           </w:tcPr>
           <w:p>
             <w:pPr>
@@ -1226,7 +1312,6 @@
               <w:end w:w="120" w:type="dxa"/>
             </w:tcMar>
             <w:vAlign w:val="center"/>
-            <w:shd w:fill="F7F9FB"/>
           </w:tcPr>
           <w:p>
             <w:pPr>
@@ -1253,7 +1338,6 @@
               <w:end w:w="120" w:type="dxa"/>
             </w:tcMar>
             <w:vAlign w:val="center"/>
-            <w:shd w:fill="F7F9FB"/>
           </w:tcPr>
           <w:p>
             <w:pPr>
@@ -1280,7 +1364,6 @@
               <w:end w:w="120" w:type="dxa"/>
             </w:tcMar>
             <w:vAlign w:val="center"/>
-            <w:shd w:fill="F7F9FB"/>
           </w:tcPr>
           <w:p>
             <w:pPr>
@@ -1312,6 +1395,7 @@
               <w:end w:w="120" w:type="dxa"/>
             </w:tcMar>
             <w:vAlign w:val="center"/>
+            <w:shd w:fill="F7F9FB"/>
           </w:tcPr>
           <w:p>
             <w:pPr>
@@ -1338,6 +1422,7 @@
               <w:end w:w="120" w:type="dxa"/>
             </w:tcMar>
             <w:vAlign w:val="center"/>
+            <w:shd w:fill="F7F9FB"/>
           </w:tcPr>
           <w:p>
             <w:pPr>
@@ -1364,6 +1449,7 @@
               <w:end w:w="120" w:type="dxa"/>
             </w:tcMar>
             <w:vAlign w:val="center"/>
+            <w:shd w:fill="F7F9FB"/>
           </w:tcPr>
           <w:p>
             <w:pPr>
@@ -3360,6 +3446,78 @@
     </w:p>
     <w:p>
       <w:pPr>
+        <w:pStyle w:val="Heading2"/>
+      </w:pPr>
+      <w:r>
+        <w:rPr>
+          <w:rFonts w:ascii="Aptos" w:hAnsi="Aptos" w:eastAsia="Noto Sans T Chinese"/>
+          <w:color w:val="2E74B5"/>
+          <w:sz w:val="26"/>
+          <w:lang w:val="en-US" w:eastAsia="zh-TW"/>
+        </w:rPr>
+        <w:t>8.1 最新資訊批判學習基線</w:t>
+      </w:r>
+    </w:p>
+    <w:p>
+      <w:r>
+        <w:rPr>
+          <w:rFonts w:ascii="Aptos" w:hAnsi="Aptos" w:eastAsia="Noto Sans T Chinese"/>
+          <w:color w:val="23313F"/>
+          <w:sz w:val="22"/>
+          <w:lang w:val="en-US" w:eastAsia="zh-TW"/>
+        </w:rPr>
+        <w:t>v0.2 第一個實作優先項目是最新資訊批判學習迴圈。原始 HTTP body 只存在 Worker 記憶體；清洗全文以 zlib 壓縮保留 30 天；URL、SHA-256、SimHash、來源 metadata、 主張與支持/反駁摘錄長期保留。完全或近似重複內容保留來源快照，但不重複計算為 獨立證據。向量資料庫、Redis 與 Celery 延後到規模指標證明必要時再引入。</w:t>
+      </w:r>
+    </w:p>
+    <w:p>
+      <w:r>
+        <w:rPr>
+          <w:rFonts w:ascii="Aptos" w:hAnsi="Aptos" w:eastAsia="Noto Sans T Chinese"/>
+          <w:color w:val="23313F"/>
+          <w:sz w:val="22"/>
+          <w:lang w:val="en-US" w:eastAsia="zh-TW"/>
+        </w:rPr>
+        <w:t xml:space="preserve">唯讀研究 Worker 與狀態變更瀏覽器 Worker 使用不同操作表面；唯讀 Worker 不接受 click、login、post、publish 或 message。研究程序允許產生 </w:t>
+      </w:r>
+      <w:r>
+        <w:rPr>
+          <w:rFonts w:ascii="DejaVu Sans Mono" w:hAnsi="DejaVu Sans Mono" w:eastAsia="DejaVu Sans Mono"/>
+          <w:color w:val="0F6B6D"/>
+          <w:sz w:val="20"/>
+          <w:lang w:val="en-US" w:eastAsia="zh-TW"/>
+        </w:rPr>
+        <w:t>inconclusive</w:t>
+      </w:r>
+      <w:r>
+        <w:rPr>
+          <w:rFonts w:ascii="Aptos" w:hAnsi="Aptos" w:eastAsia="Noto Sans T Chinese"/>
+          <w:color w:val="23313F"/>
+          <w:sz w:val="22"/>
+          <w:lang w:val="en-US" w:eastAsia="zh-TW"/>
+        </w:rPr>
+        <w:t xml:space="preserve">，但最近 10 次完成研究中無結論比例超過 50% 時必須標記退化，監督者優先改善方法而不是 重複派題。完整資料契約見 </w:t>
+      </w:r>
+      <w:r>
+        <w:rPr>
+          <w:rFonts w:ascii="DejaVu Sans Mono" w:hAnsi="DejaVu Sans Mono" w:eastAsia="DejaVu Sans Mono"/>
+          <w:color w:val="0F6B6D"/>
+          <w:sz w:val="20"/>
+          <w:lang w:val="en-US" w:eastAsia="zh-TW"/>
+        </w:rPr>
+        <w:t>docs/16-current-information-critical-learning.md</w:t>
+      </w:r>
+      <w:r>
+        <w:rPr>
+          <w:rFonts w:ascii="Aptos" w:hAnsi="Aptos" w:eastAsia="Noto Sans T Chinese"/>
+          <w:color w:val="23313F"/>
+          <w:sz w:val="22"/>
+          <w:lang w:val="en-US" w:eastAsia="zh-TW"/>
+        </w:rPr>
+        <w:t>。</w:t>
+      </w:r>
+    </w:p>
+    <w:p>
+      <w:pPr>
         <w:pStyle w:val="Heading1"/>
       </w:pPr>
       <w:r>
@@ -4233,6 +4391,14 @@
         <w:t>GET  /v1/evaluations/compare</w:t>
         <w:br/>
         <w:t>POST /v1/runtime/workers/{name}/rollback</w:t>
+        <w:br/>
+        <w:t>POST /v1/research/critical</w:t>
+        <w:br/>
+        <w:t>GET  /v1/research/runs</w:t>
+        <w:br/>
+        <w:t>GET  /v1/research/runs/{run_id}</w:t>
+        <w:br/>
+        <w:t>GET  /v1/research/quality</w:t>
       </w:r>
     </w:p>
     <w:p>
@@ -4598,7 +4764,7 @@
           <w:sz w:val="26"/>
           <w:lang w:val="en-US" w:eastAsia="zh-TW"/>
         </w:rPr>
-        <w:t>M2.1 — Work Portfolio 與產率</w:t>
+        <w:t>M2.0 — 最新資訊批判學習</w:t>
       </w:r>
     </w:p>
     <w:p>
@@ -4608,6 +4774,77 @@
         <w:numPr>
           <w:ilvl w:val="0"/>
           <w:numId w:val="45"/>
+        </w:numPr>
+      </w:pPr>
+      <w:r>
+        <w:rPr>
+          <w:rFonts w:ascii="Aptos" w:hAnsi="Aptos" w:eastAsia="Noto Sans T Chinese"/>
+          <w:color w:val="23313F"/>
+          <w:sz w:val="22"/>
+          <w:lang w:val="en-US" w:eastAsia="zh-TW"/>
+        </w:rPr>
+        <w:t>完成唯讀公開來源探索、內容清洗、快照、SHA-256/SimHash 去重與來源追溯。</w:t>
+      </w:r>
+    </w:p>
+    <w:p>
+      <w:pPr>
+        <w:spacing w:after="80" w:line="300" w:lineRule="auto"/>
+        <w:ind w:left="540" w:hanging="271"/>
+        <w:numPr>
+          <w:ilvl w:val="0"/>
+          <w:numId w:val="45"/>
+        </w:numPr>
+      </w:pPr>
+      <w:r>
+        <w:rPr>
+          <w:rFonts w:ascii="Aptos" w:hAnsi="Aptos" w:eastAsia="Noto Sans T Chinese"/>
+          <w:color w:val="23313F"/>
+          <w:sz w:val="22"/>
+          <w:lang w:val="en-US" w:eastAsia="zh-TW"/>
+        </w:rPr>
+        <w:t>完成主張級支持、反駁、精確引文驗證與明確不確定性。</w:t>
+      </w:r>
+    </w:p>
+    <w:p>
+      <w:pPr>
+        <w:spacing w:after="80" w:line="300" w:lineRule="auto"/>
+        <w:ind w:left="540" w:hanging="271"/>
+        <w:numPr>
+          <w:ilvl w:val="0"/>
+          <w:numId w:val="45"/>
+        </w:numPr>
+      </w:pPr>
+      <w:r>
+        <w:rPr>
+          <w:rFonts w:ascii="Aptos" w:hAnsi="Aptos" w:eastAsia="Noto Sans T Chinese"/>
+          <w:color w:val="23313F"/>
+          <w:sz w:val="22"/>
+          <w:lang w:val="en-US" w:eastAsia="zh-TW"/>
+        </w:rPr>
+        <w:t>10 次研究視窗的高無結論比例可觸發品質退化並回饋監督者。</w:t>
+      </w:r>
+    </w:p>
+    <w:p>
+      <w:pPr>
+        <w:pStyle w:val="Heading2"/>
+      </w:pPr>
+      <w:r>
+        <w:rPr>
+          <w:rFonts w:ascii="Aptos" w:hAnsi="Aptos" w:eastAsia="Noto Sans T Chinese"/>
+          <w:color w:val="2E74B5"/>
+          <w:sz w:val="26"/>
+          <w:lang w:val="en-US" w:eastAsia="zh-TW"/>
+        </w:rPr>
+        <w:t>M2.1 — Work Portfolio 與產率</w:t>
+      </w:r>
+    </w:p>
+    <w:p>
+      <w:pPr>
+        <w:spacing w:after="80" w:line="300" w:lineRule="auto"/>
+        <w:ind w:left="540" w:hanging="271"/>
+        <w:numPr>
+          <w:ilvl w:val="0"/>
+          <w:numId w:val="46"/>
         </w:numPr>
       </w:pPr>
       <w:r>
@@ -4626,7 +4863,7 @@
         <w:ind w:left="540" w:hanging="271"/>
         <w:numPr>
           <w:ilvl w:val="0"/>
-          <w:numId w:val="45"/>
+          <w:numId w:val="46"/>
         </w:numPr>
       </w:pPr>
       <w:r>
@@ -4645,7 +4882,7 @@
         <w:ind w:left="540" w:hanging="271"/>
         <w:numPr>
           <w:ilvl w:val="0"/>
-          <w:numId w:val="45"/>
+          <w:numId w:val="46"/>
         </w:numPr>
       </w:pPr>
       <w:r>
@@ -4678,7 +4915,7 @@
         <w:ind w:left="540" w:hanging="271"/>
         <w:numPr>
           <w:ilvl w:val="0"/>
-          <w:numId w:val="46"/>
+          <w:numId w:val="47"/>
         </w:numPr>
       </w:pPr>
       <w:r>
@@ -4697,7 +4934,7 @@
         <w:ind w:left="540" w:hanging="271"/>
         <w:numPr>
           <w:ilvl w:val="0"/>
-          <w:numId w:val="46"/>
+          <w:numId w:val="47"/>
         </w:numPr>
       </w:pPr>
       <w:r>
@@ -4716,7 +4953,7 @@
         <w:ind w:left="540" w:hanging="271"/>
         <w:numPr>
           <w:ilvl w:val="0"/>
-          <w:numId w:val="46"/>
+          <w:numId w:val="47"/>
         </w:numPr>
       </w:pPr>
       <w:r>
@@ -4749,7 +4986,7 @@
         <w:ind w:left="540" w:hanging="271"/>
         <w:numPr>
           <w:ilvl w:val="0"/>
-          <w:numId w:val="47"/>
+          <w:numId w:val="48"/>
         </w:numPr>
       </w:pPr>
       <w:r>
@@ -4768,7 +5005,7 @@
         <w:ind w:left="540" w:hanging="271"/>
         <w:numPr>
           <w:ilvl w:val="0"/>
-          <w:numId w:val="47"/>
+          <w:numId w:val="48"/>
         </w:numPr>
       </w:pPr>
       <w:r>
@@ -4787,7 +5024,7 @@
         <w:ind w:left="540" w:hanging="271"/>
         <w:numPr>
           <w:ilvl w:val="0"/>
-          <w:numId w:val="47"/>
+          <w:numId w:val="48"/>
         </w:numPr>
       </w:pPr>
       <w:r>
@@ -4820,7 +5057,7 @@
         <w:ind w:left="540" w:hanging="271"/>
         <w:numPr>
           <w:ilvl w:val="0"/>
-          <w:numId w:val="48"/>
+          <w:numId w:val="49"/>
         </w:numPr>
       </w:pPr>
       <w:r>
@@ -4839,7 +5076,7 @@
         <w:ind w:left="540" w:hanging="271"/>
         <w:numPr>
           <w:ilvl w:val="0"/>
-          <w:numId w:val="48"/>
+          <w:numId w:val="49"/>
         </w:numPr>
       </w:pPr>
       <w:r>
@@ -4858,7 +5095,7 @@
         <w:ind w:left="540" w:hanging="271"/>
         <w:numPr>
           <w:ilvl w:val="0"/>
-          <w:numId w:val="48"/>
+          <w:numId w:val="49"/>
         </w:numPr>
       </w:pPr>
       <w:r>
@@ -4891,7 +5128,7 @@
         <w:ind w:left="540" w:hanging="271"/>
         <w:numPr>
           <w:ilvl w:val="0"/>
-          <w:numId w:val="49"/>
+          <w:numId w:val="50"/>
         </w:numPr>
       </w:pPr>
       <w:r>
@@ -4910,7 +5147,7 @@
         <w:ind w:left="540" w:hanging="271"/>
         <w:numPr>
           <w:ilvl w:val="0"/>
-          <w:numId w:val="49"/>
+          <w:numId w:val="50"/>
         </w:numPr>
       </w:pPr>
       <w:r>
@@ -4929,7 +5166,7 @@
         <w:ind w:left="540" w:hanging="271"/>
         <w:numPr>
           <w:ilvl w:val="0"/>
-          <w:numId w:val="49"/>
+          <w:numId w:val="50"/>
         </w:numPr>
       </w:pPr>
       <w:r>
@@ -4973,7 +5210,7 @@
         <w:ind w:left="540" w:hanging="271"/>
         <w:numPr>
           <w:ilvl w:val="0"/>
-          <w:numId w:val="50"/>
+          <w:numId w:val="51"/>
         </w:numPr>
       </w:pPr>
       <w:r>
@@ -4992,7 +5229,7 @@
         <w:ind w:left="540" w:hanging="271"/>
         <w:numPr>
           <w:ilvl w:val="0"/>
-          <w:numId w:val="50"/>
+          <w:numId w:val="51"/>
         </w:numPr>
       </w:pPr>
       <w:r>
@@ -5011,7 +5248,7 @@
         <w:ind w:left="540" w:hanging="271"/>
         <w:numPr>
           <w:ilvl w:val="0"/>
-          <w:numId w:val="50"/>
+          <w:numId w:val="51"/>
         </w:numPr>
       </w:pPr>
       <w:r>
@@ -5030,7 +5267,7 @@
         <w:ind w:left="540" w:hanging="271"/>
         <w:numPr>
           <w:ilvl w:val="0"/>
-          <w:numId w:val="50"/>
+          <w:numId w:val="51"/>
         </w:numPr>
       </w:pPr>
       <w:r>
@@ -5049,7 +5286,7 @@
         <w:ind w:left="540" w:hanging="271"/>
         <w:numPr>
           <w:ilvl w:val="0"/>
-          <w:numId w:val="50"/>
+          <w:numId w:val="51"/>
         </w:numPr>
       </w:pPr>
       <w:r>
@@ -5068,7 +5305,7 @@
         <w:ind w:left="540" w:hanging="271"/>
         <w:numPr>
           <w:ilvl w:val="0"/>
-          <w:numId w:val="50"/>
+          <w:numId w:val="51"/>
         </w:numPr>
       </w:pPr>
       <w:r>
@@ -5087,7 +5324,7 @@
         <w:ind w:left="540" w:hanging="271"/>
         <w:numPr>
           <w:ilvl w:val="0"/>
-          <w:numId w:val="50"/>
+          <w:numId w:val="51"/>
         </w:numPr>
       </w:pPr>
       <w:r>
@@ -5117,7 +5354,7 @@
         <w:ind w:left="540" w:hanging="271"/>
         <w:numPr>
           <w:ilvl w:val="0"/>
-          <w:numId w:val="51"/>
+          <w:numId w:val="52"/>
         </w:numPr>
       </w:pPr>
       <w:r>
@@ -5136,7 +5373,26 @@
         <w:ind w:left="540" w:hanging="271"/>
         <w:numPr>
           <w:ilvl w:val="0"/>
-          <w:numId w:val="51"/>
+          <w:numId w:val="52"/>
+        </w:numPr>
+      </w:pPr>
+      <w:r>
+        <w:rPr>
+          <w:rFonts w:ascii="Aptos" w:hAnsi="Aptos" w:eastAsia="Noto Sans T Chinese"/>
+          <w:color w:val="23313F"/>
+          <w:sz w:val="22"/>
+          <w:lang w:val="en-US" w:eastAsia="zh-TW"/>
+        </w:rPr>
+        <w:t>最新資訊研究的來源追溯率為 100%，且高無結論比例會觸發退化而非偽裝成功；</w:t>
+      </w:r>
+    </w:p>
+    <w:p>
+      <w:pPr>
+        <w:spacing w:after="80" w:line="300" w:lineRule="auto"/>
+        <w:ind w:left="540" w:hanging="271"/>
+        <w:numPr>
+          <w:ilvl w:val="0"/>
+          <w:numId w:val="52"/>
         </w:numPr>
       </w:pPr>
       <w:r>
@@ -5155,7 +5411,7 @@
         <w:ind w:left="540" w:hanging="271"/>
         <w:numPr>
           <w:ilvl w:val="0"/>
-          <w:numId w:val="51"/>
+          <w:numId w:val="52"/>
         </w:numPr>
       </w:pPr>
       <w:r>
@@ -5174,7 +5430,7 @@
         <w:ind w:left="540" w:hanging="271"/>
         <w:numPr>
           <w:ilvl w:val="0"/>
-          <w:numId w:val="51"/>
+          <w:numId w:val="52"/>
         </w:numPr>
       </w:pPr>
       <w:r>
@@ -5207,7 +5463,7 @@
         <w:ind w:left="540" w:hanging="271"/>
         <w:numPr>
           <w:ilvl w:val="0"/>
-          <w:numId w:val="52"/>
+          <w:numId w:val="53"/>
         </w:numPr>
       </w:pPr>
       <w:r>
@@ -5226,7 +5482,7 @@
         <w:ind w:left="540" w:hanging="271"/>
         <w:numPr>
           <w:ilvl w:val="0"/>
-          <w:numId w:val="52"/>
+          <w:numId w:val="53"/>
         </w:numPr>
       </w:pPr>
       <w:r>
@@ -5254,7 +5510,7 @@
         <w:ind w:left="540" w:hanging="271"/>
         <w:numPr>
           <w:ilvl w:val="0"/>
-          <w:numId w:val="52"/>
+          <w:numId w:val="53"/>
         </w:numPr>
       </w:pPr>
       <w:r>
@@ -5273,7 +5529,7 @@
         <w:ind w:left="540" w:hanging="271"/>
         <w:numPr>
           <w:ilvl w:val="0"/>
-          <w:numId w:val="52"/>
+          <w:numId w:val="53"/>
         </w:numPr>
       </w:pPr>
       <w:r>
@@ -5317,7 +5573,7 @@
         <w:ind w:left="540" w:hanging="271"/>
         <w:numPr>
           <w:ilvl w:val="0"/>
-          <w:numId w:val="53"/>
+          <w:numId w:val="54"/>
         </w:numPr>
       </w:pPr>
       <w:r>
@@ -5346,7 +5602,7 @@
         <w:ind w:left="540" w:hanging="271"/>
         <w:numPr>
           <w:ilvl w:val="0"/>
-          <w:numId w:val="53"/>
+          <w:numId w:val="54"/>
         </w:numPr>
       </w:pPr>
       <w:r>
@@ -5375,7 +5631,7 @@
         <w:ind w:left="540" w:hanging="271"/>
         <w:numPr>
           <w:ilvl w:val="0"/>
-          <w:numId w:val="53"/>
+          <w:numId w:val="54"/>
         </w:numPr>
       </w:pPr>
       <w:r>
@@ -5404,7 +5660,7 @@
         <w:ind w:left="540" w:hanging="271"/>
         <w:numPr>
           <w:ilvl w:val="0"/>
-          <w:numId w:val="53"/>
+          <w:numId w:val="54"/>
         </w:numPr>
       </w:pPr>
       <w:r>
@@ -5433,7 +5689,7 @@
         <w:ind w:left="540" w:hanging="271"/>
         <w:numPr>
           <w:ilvl w:val="0"/>
-          <w:numId w:val="53"/>
+          <w:numId w:val="54"/>
         </w:numPr>
       </w:pPr>
       <w:r>
@@ -5462,7 +5718,7 @@
         <w:ind w:left="540" w:hanging="271"/>
         <w:numPr>
           <w:ilvl w:val="0"/>
-          <w:numId w:val="53"/>
+          <w:numId w:val="54"/>
         </w:numPr>
       </w:pPr>
       <w:r>
@@ -5491,7 +5747,7 @@
         <w:ind w:left="540" w:hanging="271"/>
         <w:numPr>
           <w:ilvl w:val="0"/>
-          <w:numId w:val="53"/>
+          <w:numId w:val="54"/>
         </w:numPr>
       </w:pPr>
       <w:r>
@@ -5545,7 +5801,7 @@
         <w:ind w:left="540" w:hanging="271"/>
         <w:numPr>
           <w:ilvl w:val="0"/>
-          <w:numId w:val="54"/>
+          <w:numId w:val="55"/>
         </w:numPr>
       </w:pPr>
       <w:r>
@@ -5564,7 +5820,7 @@
         <w:ind w:left="540" w:hanging="271"/>
         <w:numPr>
           <w:ilvl w:val="0"/>
-          <w:numId w:val="54"/>
+          <w:numId w:val="55"/>
         </w:numPr>
       </w:pPr>
       <w:r>
@@ -5583,7 +5839,7 @@
         <w:ind w:left="540" w:hanging="271"/>
         <w:numPr>
           <w:ilvl w:val="0"/>
-          <w:numId w:val="54"/>
+          <w:numId w:val="55"/>
         </w:numPr>
       </w:pPr>
       <w:r>
@@ -5602,7 +5858,7 @@
         <w:ind w:left="540" w:hanging="271"/>
         <w:numPr>
           <w:ilvl w:val="0"/>
-          <w:numId w:val="54"/>
+          <w:numId w:val="55"/>
         </w:numPr>
       </w:pPr>
       <w:r>
@@ -5621,7 +5877,7 @@
         <w:ind w:left="540" w:hanging="271"/>
         <w:numPr>
           <w:ilvl w:val="0"/>
-          <w:numId w:val="54"/>
+          <w:numId w:val="55"/>
         </w:numPr>
       </w:pPr>
       <w:r>
@@ -5640,7 +5896,7 @@
         <w:ind w:left="540" w:hanging="271"/>
         <w:numPr>
           <w:ilvl w:val="0"/>
-          <w:numId w:val="54"/>
+          <w:numId w:val="55"/>
         </w:numPr>
       </w:pPr>
       <w:r>
@@ -5659,7 +5915,7 @@
         <w:ind w:left="540" w:hanging="271"/>
         <w:numPr>
           <w:ilvl w:val="0"/>
-          <w:numId w:val="54"/>
+          <w:numId w:val="55"/>
         </w:numPr>
       </w:pPr>
       <w:r>
@@ -5727,7 +5983,7 @@
               <w:sz w:val="17"/>
               <w:lang w:val="en-US" w:eastAsia="zh-TW"/>
             </w:rPr>
-            <w:t>Digital Life Kernel v0.2 Development  •  Apache-2.0  •  2026-08-02</w:t>
+            <w:t>Digital Life Kernel v0.2 Development  •  Apache-2.0  •  2026-08-08</w:t>
           </w:r>
         </w:p>
       </w:tc>
@@ -7723,6 +7979,39 @@
   </w:abstractNum>
   <w:num w:numId="54">
     <w:abstractNumId w:val="53"/>
+  </w:num>
+  <w:abstractNum w:abstractNumId="54">
+    <w:multiLevelType w:val="multilevel"/>
+    <w:lvl w:ilvl="0">
+      <w:start w:val="1"/>
+      <w:numFmt w:val="bullet"/>
+      <w:lvlText w:val="•"/>
+      <w:suff w:val="space"/>
+      <w:pPr>
+        <w:ind w:left="540" w:hanging="270"/>
+      </w:pPr>
+    </w:lvl>
+    <w:lvl w:ilvl="1">
+      <w:start w:val="1"/>
+      <w:numFmt w:val="bullet"/>
+      <w:lvlText w:val="◦"/>
+      <w:suff w:val="space"/>
+      <w:pPr>
+        <w:ind w:left="900" w:hanging="270"/>
+      </w:pPr>
+    </w:lvl>
+    <w:lvl w:ilvl="2">
+      <w:start w:val="1"/>
+      <w:numFmt w:val="bullet"/>
+      <w:lvlText w:val="▪"/>
+      <w:suff w:val="space"/>
+      <w:pPr>
+        <w:ind w:left="1260" w:hanging="270"/>
+      </w:pPr>
+    </w:lvl>
+  </w:abstractNum>
+  <w:num w:numId="55">
+    <w:abstractNumId w:val="54"/>
   </w:num>
 </w:numbering>
 </file>

</xml_diff>